<commit_message>
fix: keep the control's type in the table date and two-column table layouts, re-export and correct the results
The table date layouts set the education date in 11 pt regular instead of the
control's 10.5 pt italic, and the two-column table set the school's city in
10.5 pt italic instead of 11 pt regular, so each changed two things. In the
1.3 in date column the larger education date wrapped and split the education
entry, which cost 6 of the 12 fields reported.

All ten files were exported again in one run. table-dates-narrow now reads
40/46 (jobs 6) instead of 34/46. table-dates-left and two-column-table read
the same fields as before, and the PDFs of the other seven layouts are byte
for byte the same. test_analyze.py now checks that every file in docx/ keeps
the control's text formatting, and the README has a correction note.
</commit_message>
<xml_diff>
--- a/findings/2026-10-28-layout/docx/table-dates-left.docx
+++ b/findings/2026-10-28-layout/docx/table-dates-left.docx
@@ -95,7 +95,10 @@
               <w:jc w:val="left"/>
             </w:pPr>
             <w:r>
-              <w:rPr/>
+              <w:rPr>
+                <w:i/>
+                <w:sz w:val="21"/>
+              </w:rPr>
               <w:t>Aug 2022 – May 2026</w:t>
             </w:r>
           </w:p>

</xml_diff>